<commit_message>
Atualizei esquema SQL, docs e limpei DS_Store
</commit_message>
<xml_diff>
--- a/doc/ProjetoFinal_MiguelOliveira.docx
+++ b/doc/ProjetoFinal_MiguelOliveira.docx
@@ -250,6 +250,32 @@
           <w:lang w:val="pt-PT"/>
         </w:rPr>
         <w:t>Modelo Lógico</w:t>
+      </w:r>
+    </w:p>
+    <w:p>
+      <w:pPr>
+        <w:pStyle w:val="ListParagraph"/>
+        <w:numPr>
+          <w:ilvl w:val="0"/>
+          <w:numId w:val="2"/>
+        </w:numPr>
+        <w:rPr>
+          <w:lang w:val="pt-PT"/>
+        </w:rPr>
+      </w:pPr>
+      <w:proofErr w:type="spellStart"/>
+      <w:r>
+        <w:rPr>
+          <w:lang w:val="pt-PT"/>
+        </w:rPr>
+        <w:t>Depositório</w:t>
+      </w:r>
+      <w:proofErr w:type="spellEnd"/>
+      <w:r>
+        <w:rPr>
+          <w:lang w:val="pt-PT"/>
+        </w:rPr>
+        <w:t xml:space="preserve"> do GitHub </w:t>
       </w:r>
     </w:p>
     <w:p>

</xml_diff>

<commit_message>
Documentação não enviada no último commit
</commit_message>
<xml_diff>
--- a/doc/ProjetoFinal_MiguelOliveira.docx
+++ b/doc/ProjetoFinal_MiguelOliveira.docx
@@ -289,6 +289,70 @@
           <w:lang w:val="pt-PT"/>
         </w:rPr>
       </w:pPr>
+      <w:r>
+        <w:rPr>
+          <w:lang w:val="pt-PT"/>
+        </w:rPr>
+        <w:t>Arquitetura da base de dados</w:t>
+      </w:r>
+    </w:p>
+    <w:p>
+      <w:pPr>
+        <w:pStyle w:val="ListParagraph"/>
+        <w:numPr>
+          <w:ilvl w:val="0"/>
+          <w:numId w:val="2"/>
+        </w:numPr>
+        <w:rPr>
+          <w:lang w:val="pt-PT"/>
+        </w:rPr>
+      </w:pPr>
+      <w:r>
+        <w:rPr>
+          <w:lang w:val="pt-PT"/>
+        </w:rPr>
+        <w:t>Ligação à base de dados (</w:t>
+      </w:r>
+      <w:proofErr w:type="spellStart"/>
+      <w:r>
+        <w:rPr>
+          <w:lang w:val="pt-PT"/>
+        </w:rPr>
+        <w:t>php</w:t>
+      </w:r>
+      <w:proofErr w:type="spellEnd"/>
+      <w:r>
+        <w:rPr>
+          <w:lang w:val="pt-PT"/>
+        </w:rPr>
+        <w:t>)</w:t>
+      </w:r>
+    </w:p>
+    <w:p>
+      <w:pPr>
+        <w:pStyle w:val="ListParagraph"/>
+        <w:numPr>
+          <w:ilvl w:val="0"/>
+          <w:numId w:val="2"/>
+        </w:numPr>
+        <w:rPr>
+          <w:lang w:val="pt-PT"/>
+        </w:rPr>
+      </w:pPr>
+      <w:proofErr w:type="spellStart"/>
+      <w:r>
+        <w:rPr>
+          <w:lang w:val="pt-PT"/>
+        </w:rPr>
+        <w:t>Endpoints</w:t>
+      </w:r>
+      <w:proofErr w:type="spellEnd"/>
+      <w:r>
+        <w:rPr>
+          <w:lang w:val="pt-PT"/>
+        </w:rPr>
+        <w:t xml:space="preserve"> de leitura da api </w:t>
+      </w:r>
     </w:p>
     <w:p/>
     <w:sectPr>

</xml_diff>